<commit_message>
Add Documents to Status Report 1
</commit_message>
<xml_diff>
--- a/Documentation/StatusReport/Statusbericht_1_test.docx
+++ b/Documentation/StatusReport/Statusbericht_1_test.docx
@@ -208,10 +208,7 @@
         <w:spacing w:after="0"/>
       </w:pPr>
       <w:r>
-        <w:t>Tests (</w:t>
-      </w:r>
-      <w:r>
-        <w:t>SELECT-</w:t>
+        <w:t>Tests (SELECT-</w:t>
       </w:r>
       <w:proofErr w:type="spellStart"/>
       <w:r>
@@ -379,115 +376,17 @@
     </w:p>
     <w:p>
       <w:pPr>
-        <w:spacing w:after="0"/>
-        <w:rPr>
-          <w:b/>
-          <w:bCs/>
-          <w:sz w:val="32"/>
-          <w:szCs w:val="32"/>
-        </w:rPr>
-      </w:pPr>
-    </w:p>
-    <w:p>
-      <w:pPr>
-        <w:spacing w:after="0"/>
-        <w:rPr>
-          <w:b/>
-          <w:bCs/>
-          <w:sz w:val="32"/>
-          <w:szCs w:val="32"/>
-        </w:rPr>
-      </w:pPr>
-      <w:r>
-        <w:rPr>
-          <w:b/>
-          <w:bCs/>
-          <w:sz w:val="32"/>
-          <w:szCs w:val="32"/>
-        </w:rPr>
-        <w:t>2 Vergleichung der Realität mit Planung</w:t>
-      </w:r>
-    </w:p>
-    <w:p>
-      <w:pPr>
-        <w:spacing w:after="0"/>
-      </w:pPr>
-      <w:r>
-        <w:t>Generell gesagt, stehen wir zurzeit bestens im Plan. Kenan hat seine organisatorischen Aufgaben gemacht und hilft nun den anderen Teammitgliedern. Sanjivan ist mit seinem erstem Mockup nun fertig. Er ist damit noch in der Planung und wird später noch mehr Unterstützung mit dem Frontend bekommen. Egor ist auch perfekt mit seinen Aufgaben fortgekommen. Er hat die ganze Grundstruktur gemacht und das ERM-Diagramm wird bis zum Ende des Statusberichtes ebenfalls vollendet sein. Gian kommt mit der Planung auch mit. Er hat bereits die ganze Authentifizierung erstellt</w:t>
-      </w:r>
-      <w:r>
-        <w:t xml:space="preserve"> und die Struktur und Container im Docker stehen auch alle bereit. Allgemein kann man sagen, dass wir in der </w:t>
-      </w:r>
-      <w:r>
-        <w:lastRenderedPageBreak/>
-        <w:t>Realität gerade weiter sind als geplant. Das liegt daran das einige Teammitglieder in den Ferien weiter am Projekt gearbeitet haben aus purem Interesse. Dies hat zu einer hervorragenden Situation planmässig geführt.</w:t>
-      </w:r>
-    </w:p>
-    <w:p>
-      <w:pPr>
-        <w:spacing w:after="0"/>
-      </w:pPr>
-    </w:p>
-    <w:p>
-      <w:pPr>
-        <w:spacing w:after="0"/>
-        <w:rPr>
-          <w:b/>
-          <w:bCs/>
-          <w:sz w:val="32"/>
-          <w:szCs w:val="32"/>
-        </w:rPr>
-      </w:pPr>
-      <w:r>
-        <w:rPr>
-          <w:b/>
-          <w:bCs/>
-          <w:sz w:val="32"/>
-          <w:szCs w:val="32"/>
-        </w:rPr>
-        <w:t>3 Grobe Abweichungen</w:t>
-      </w:r>
-    </w:p>
-    <w:p>
-      <w:pPr>
-        <w:spacing w:after="0"/>
-      </w:pPr>
-    </w:p>
-    <w:p>
-      <w:pPr>
-        <w:spacing w:after="0"/>
-      </w:pPr>
-      <w:r>
-        <w:t xml:space="preserve">(Falls es welche gibt muss </w:t>
-      </w:r>
-      <w:proofErr w:type="spellStart"/>
-      <w:r>
-        <w:t>sanji</w:t>
-      </w:r>
-      <w:proofErr w:type="spellEnd"/>
-      <w:r>
-        <w:t xml:space="preserve"> schreiben lol)</w:t>
-      </w:r>
-    </w:p>
-    <w:p>
-      <w:pPr>
-        <w:spacing w:after="0"/>
-      </w:pPr>
-      <w:r>
-        <w:t>Derzeit sind mir im Projekt zu keinen grossen Abweichungen gekommen. Wir denken es dafür zwei Hauptgründe gibt:</w:t>
-      </w:r>
-    </w:p>
-    <w:p>
-      <w:pPr>
         <w:pStyle w:val="Listenabsatz"/>
         <w:numPr>
           <w:ilvl w:val="0"/>
-          <w:numId w:val="6"/>
+          <w:numId w:val="9"/>
         </w:numPr>
-        <w:spacing w:after="0"/>
-      </w:pPr>
-      <w:r>
-        <w:t>Eine sehr umfassende Planung für das ganze Projekt, was jedem Teammitglied zeigt was es alles noch zu erledigen hat.</w:t>
+      </w:pPr>
+      <w:r>
+        <w:t>Frontend Projekt mit Abhängigkeiten &amp; Erweiterungen installieren</w:t>
+      </w:r>
+      <w:r>
+        <w:t xml:space="preserve"> (100%)</w:t>
       </w:r>
     </w:p>
     <w:p>
@@ -495,27 +394,125 @@
         <w:pStyle w:val="Listenabsatz"/>
         <w:numPr>
           <w:ilvl w:val="0"/>
-          <w:numId w:val="6"/>
+          <w:numId w:val="9"/>
         </w:numPr>
-        <w:spacing w:after="0"/>
-      </w:pPr>
-      <w:r>
-        <w:t>Das Interesse des Teams, was dazu geführt hat, dass wir einen grossen Teil unserer Freizeit nehmen, um dieses Projekt zu verbessern.</w:t>
-      </w:r>
-    </w:p>
-    <w:p>
-      <w:pPr>
-        <w:spacing w:after="0"/>
-      </w:pPr>
-      <w:r>
-        <w:t>Dank diesen zwei Punkten haben und werden wir wahrscheinlich keine grossen Abweichungen haben.</w:t>
-      </w:r>
-    </w:p>
-    <w:p>
-      <w:pPr>
-        <w:spacing w:after="0"/>
-      </w:pPr>
-    </w:p>
+      </w:pPr>
+      <w:r>
+        <w:t>DB-Planung des ERM-Diagramms</w:t>
+      </w:r>
+      <w:r>
+        <w:t xml:space="preserve"> (100%)</w:t>
+      </w:r>
+    </w:p>
+    <w:p>
+      <w:pPr>
+        <w:pStyle w:val="Listenabsatz"/>
+        <w:numPr>
+          <w:ilvl w:val="0"/>
+          <w:numId w:val="9"/>
+        </w:numPr>
+      </w:pPr>
+      <w:r>
+        <w:t>Planung der Aufgabenverteilung und Verantwortlichkeiten</w:t>
+      </w:r>
+      <w:r>
+        <w:t xml:space="preserve"> (90%)</w:t>
+      </w:r>
+    </w:p>
+    <w:p>
+      <w:pPr>
+        <w:pStyle w:val="Listenabsatz"/>
+        <w:numPr>
+          <w:ilvl w:val="0"/>
+          <w:numId w:val="9"/>
+        </w:numPr>
+      </w:pPr>
+      <w:r>
+        <w:t>Zusammensetzung der Beziehungen im ERM-Diagramm</w:t>
+      </w:r>
+      <w:r>
+        <w:t xml:space="preserve"> (100%)</w:t>
+      </w:r>
+    </w:p>
+    <w:p>
+      <w:pPr>
+        <w:pStyle w:val="Listenabsatz"/>
+        <w:numPr>
+          <w:ilvl w:val="0"/>
+          <w:numId w:val="9"/>
+        </w:numPr>
+      </w:pPr>
+      <w:r>
+        <w:t>Entwicklung der Backend Dateiplanung</w:t>
+      </w:r>
+      <w:r>
+        <w:t xml:space="preserve"> (100%)</w:t>
+      </w:r>
+    </w:p>
+    <w:p>
+      <w:pPr>
+        <w:pStyle w:val="Listenabsatz"/>
+        <w:numPr>
+          <w:ilvl w:val="0"/>
+          <w:numId w:val="9"/>
+        </w:numPr>
+      </w:pPr>
+      <w:r>
+        <w:t>Planung der Pages &amp; Design mit Strukturierung</w:t>
+      </w:r>
+      <w:r>
+        <w:t xml:space="preserve"> (100%)</w:t>
+      </w:r>
+    </w:p>
+    <w:p>
+      <w:pPr>
+        <w:pStyle w:val="Listenabsatz"/>
+        <w:numPr>
+          <w:ilvl w:val="0"/>
+          <w:numId w:val="9"/>
+        </w:numPr>
+      </w:pPr>
+      <w:r>
+        <w:t>Grundstruktur der Frontend Umgebung fertigstellen</w:t>
+      </w:r>
+      <w:r>
+        <w:t xml:space="preserve"> (100%)</w:t>
+      </w:r>
+    </w:p>
+    <w:p>
+      <w:pPr>
+        <w:pStyle w:val="Listenabsatz"/>
+        <w:numPr>
+          <w:ilvl w:val="0"/>
+          <w:numId w:val="9"/>
+        </w:numPr>
+      </w:pPr>
+      <w:r>
+        <w:t>Mockup aller Pages erstellen</w:t>
+      </w:r>
+      <w:r>
+        <w:t xml:space="preserve"> (50%)</w:t>
+      </w:r>
+    </w:p>
+    <w:p>
+      <w:pPr>
+        <w:pStyle w:val="Listenabsatz"/>
+        <w:numPr>
+          <w:ilvl w:val="0"/>
+          <w:numId w:val="9"/>
+        </w:numPr>
+      </w:pPr>
+      <w:r>
+        <w:t>Frontend Landingpage rea</w:t>
+      </w:r>
+      <w:r>
+        <w:t>lisieren</w:t>
+      </w:r>
+      <w:r>
+        <w:t xml:space="preserve"> (20%)</w:t>
+      </w:r>
+    </w:p>
+    <w:p/>
     <w:p>
       <w:pPr>
         <w:spacing w:after="0"/>
@@ -526,13 +523,136 @@
           <w:szCs w:val="32"/>
         </w:rPr>
       </w:pPr>
-      <w:r>
+    </w:p>
+    <w:p>
+      <w:pPr>
+        <w:spacing w:after="0"/>
         <w:rPr>
           <w:b/>
           <w:bCs/>
           <w:sz w:val="32"/>
           <w:szCs w:val="32"/>
         </w:rPr>
+      </w:pPr>
+      <w:r>
+        <w:rPr>
+          <w:b/>
+          <w:bCs/>
+          <w:sz w:val="32"/>
+          <w:szCs w:val="32"/>
+        </w:rPr>
+        <w:t>2 Vergleichung der Realität mit Planung</w:t>
+      </w:r>
+    </w:p>
+    <w:p>
+      <w:pPr>
+        <w:spacing w:after="0"/>
+      </w:pPr>
+      <w:r>
+        <w:t>Das Projekt befindet sich aktuell in einer stabilen Zwischenphase und verläuft grösstenteils gemäss Planung. Die organisatorischen Aufgaben sowie die Aufteilung im Team wurden erfolgreich umgesetzt, wodurch eine klare Struktur entstanden ist. Die Backend-Entwicklung ist bereits weit fortgeschritten, insbesondere die Authentifizierung und die wichtigsten CRUD-Funktionalitäten sind implementiert. Auch die Datenbank wurde grösstenteils geplant und technisch umgesetzt, sodass eine funktionierende Grundlage vorhanden ist.</w:t>
+      </w:r>
+    </w:p>
+    <w:p>
+      <w:pPr>
+        <w:spacing w:after="0"/>
+      </w:pPr>
+      <w:r>
+        <w:t xml:space="preserve">Im Vergleich zur ursprünglichen Planung sind </w:t>
+      </w:r>
+      <w:proofErr w:type="gramStart"/>
+      <w:r>
+        <w:t>Backend</w:t>
+      </w:r>
+      <w:proofErr w:type="gramEnd"/>
+      <w:r>
+        <w:t xml:space="preserve"> und Datenbank teilweise weiter als erwartet. Das Frontend ist hingegen noch weniger weit fortgeschritten, da bisher vor allem die Planung, Strukturierung und erste Mockups umgesetzt wurden.</w:t>
+      </w:r>
+    </w:p>
+    <w:p>
+      <w:pPr>
+        <w:spacing w:after="0"/>
+      </w:pPr>
+      <w:r>
+        <w:t>Insgesamt sind die zentralen Grundlagen des Projekts vorhanden und die nächsten Schritte klar definiert. Der Fokus liegt nun auf der weiteren Umsetzung der Benutzeroberfläche sowie der Integration aller Komponenten, um d</w:t>
+      </w:r>
+      <w:r>
+        <w:t xml:space="preserve">ie Website </w:t>
+      </w:r>
+      <w:r>
+        <w:t>funktional abzuschliessen.</w:t>
+      </w:r>
+    </w:p>
+    <w:p>
+      <w:pPr>
+        <w:spacing w:after="0"/>
+      </w:pPr>
+    </w:p>
+    <w:p>
+      <w:pPr>
+        <w:spacing w:after="0"/>
+        <w:rPr>
+          <w:b/>
+          <w:bCs/>
+          <w:sz w:val="32"/>
+          <w:szCs w:val="32"/>
+        </w:rPr>
+      </w:pPr>
+      <w:r>
+        <w:rPr>
+          <w:b/>
+          <w:bCs/>
+          <w:sz w:val="32"/>
+          <w:szCs w:val="32"/>
+        </w:rPr>
+        <w:t>3 Grobe Abweichungen</w:t>
+      </w:r>
+    </w:p>
+    <w:p>
+      <w:pPr>
+        <w:spacing w:after="0"/>
+      </w:pPr>
+      <w:r>
+        <w:t>Eine Abweichung zeigt sich im Frontend, das aktuell hinter dem geplanten Stand liegt. Der Hauptgrund dafür ist Zeitmangel, wodurch weniger aktiv an der Umsetzung gearbeitet werden konnte.</w:t>
+      </w:r>
+    </w:p>
+    <w:p>
+      <w:pPr>
+        <w:spacing w:after="0"/>
+      </w:pPr>
+      <w:r>
+        <w:t>Um diese Abweichung auszugleichen, wird der Fokus in den nächsten Arbeitsschritten gezielt auf die Frontend-Entwicklung gelegt. Durch die bereits vorhandene Planung und die erstellten Mockups kann die Umsetzung effizient erfolgen.</w:t>
+      </w:r>
+    </w:p>
+    <w:p>
+      <w:pPr>
+        <w:spacing w:after="0"/>
+      </w:pPr>
+      <w:r>
+        <w:t>Ziel ist es, den Rückstand schrittweise aufzuholen und die fehlenden Komponenten in enger Abstimmung mit dem Backend zu realisieren.</w:t>
+      </w:r>
+    </w:p>
+    <w:p>
+      <w:pPr>
+        <w:spacing w:after="0"/>
+      </w:pPr>
+    </w:p>
+    <w:p>
+      <w:pPr>
+        <w:spacing w:after="0"/>
+        <w:rPr>
+          <w:b/>
+          <w:bCs/>
+          <w:sz w:val="32"/>
+          <w:szCs w:val="32"/>
+        </w:rPr>
+      </w:pPr>
+      <w:r>
+        <w:rPr>
+          <w:b/>
+          <w:bCs/>
+          <w:sz w:val="32"/>
+          <w:szCs w:val="32"/>
+        </w:rPr>
         <w:t>4 Stand des Projektes</w:t>
       </w:r>
     </w:p>
@@ -621,6 +741,7 @@
         <w:spacing w:after="0"/>
       </w:pPr>
       <w:r>
+        <w:lastRenderedPageBreak/>
         <w:t>Aktuell wird das Datenmodell weiter überprüft und bei Bedarf angepasst. Dabei geht es vor allem darum, mögliche Unklarheiten zu beseitigen und die Struktur zu optimieren. Einige Teile des Datenmodells sind noch nicht vollständig finalisiert, da sich Anforderungen im Projektverlauf teilweise ändern. Diese werden laufend ergänzt und verbessert. Insgesamt befindet sich die Datenbank in einer stabilen Zwischenphase und bildet eine solide Grundlage für die weitere Entwicklung.</w:t>
       </w:r>
     </w:p>
@@ -712,7 +833,6 @@
         <w:spacing w:after="0"/>
       </w:pPr>
       <w:r>
-        <w:lastRenderedPageBreak/>
         <w:t>sowie die Docker-Umgebung mit MS SQL sind einsatzbereit.</w:t>
       </w:r>
     </w:p>
@@ -753,19 +873,7 @@
         <w:spacing w:after="0"/>
       </w:pPr>
       <w:r>
-        <w:t xml:space="preserve">Ich bin mir noch nicht </w:t>
-      </w:r>
-      <w:r>
-        <w:t>sicher,</w:t>
-      </w:r>
-      <w:r>
-        <w:t xml:space="preserve"> ob es auch auf </w:t>
-      </w:r>
-      <w:r>
-        <w:t>Windows</w:t>
-      </w:r>
-      <w:r>
-        <w:t xml:space="preserve"> laufen würde.</w:t>
+        <w:t>Ich bin mir noch nicht sicher, ob es auch auf Windows laufen würde.</w:t>
       </w:r>
     </w:p>
     <w:p>
@@ -828,13 +936,7 @@
         <w:spacing w:after="0"/>
       </w:pPr>
       <w:r>
-        <w:t xml:space="preserve">Implementierung der Versionierung und Korrekter </w:t>
-      </w:r>
-      <w:r>
-        <w:t>Verbindung</w:t>
-      </w:r>
-      <w:r>
-        <w:t xml:space="preserve"> zum Frontend.</w:t>
+        <w:t>Implementierung der Versionierung und Korrekter Verbindung zum Frontend.</w:t>
       </w:r>
     </w:p>
     <w:p>
@@ -858,14 +960,345 @@
       </w:r>
     </w:p>
     <w:p>
-      <w:pPr>
-        <w:spacing w:after="0"/>
-      </w:pPr>
-    </w:p>
-    <w:p>
-      <w:pPr>
-        <w:spacing w:after="0"/>
-      </w:pPr>
+      <w:r>
+        <w:t xml:space="preserve">Ich habe das Frontend-Projekt eingerichtet und alle notwendigen Abhängigkeiten installiert. </w:t>
+      </w:r>
+      <w:r>
+        <w:t>Davor</w:t>
+      </w:r>
+      <w:r>
+        <w:t xml:space="preserve"> habe ich die Datenbank geplant und </w:t>
+      </w:r>
+      <w:r>
+        <w:t>im</w:t>
+      </w:r>
+      <w:r>
+        <w:t xml:space="preserve"> ERM-Diagramm</w:t>
+      </w:r>
+      <w:r>
+        <w:t xml:space="preserve"> </w:t>
+      </w:r>
+      <w:r>
+        <w:t>die wichtigsten</w:t>
+      </w:r>
+      <w:r>
+        <w:t xml:space="preserve"> </w:t>
+      </w:r>
+      <w:r>
+        <w:t xml:space="preserve">Beziehungen definiert </w:t>
+      </w:r>
+      <w:proofErr w:type="gramStart"/>
+      <w:r>
+        <w:t>wurden .</w:t>
+      </w:r>
+      <w:proofErr w:type="gramEnd"/>
+    </w:p>
+    <w:p>
+      <w:r>
+        <w:t xml:space="preserve">Danach habe ich die Aufgaben im Team verteilt und die Verantwortlichkeiten festgelegt. Zusätzlich habe ich die Struktur des </w:t>
+      </w:r>
+      <w:proofErr w:type="spellStart"/>
+      <w:r>
+        <w:t>Backends</w:t>
+      </w:r>
+      <w:proofErr w:type="spellEnd"/>
+      <w:r>
+        <w:t xml:space="preserve"> geplant, mit einer klaren Trennung in Controller, Services und Models für eine saubere </w:t>
+      </w:r>
+      <w:proofErr w:type="gramStart"/>
+      <w:r>
+        <w:t>Architektur .</w:t>
+      </w:r>
+      <w:proofErr w:type="gramEnd"/>
+    </w:p>
+    <w:p>
+      <w:r>
+        <w:t xml:space="preserve">Im Frontend habe ich alle benötigten Seiten definiert und strukturiert, darunter Landingpage, Dashboard und Portfolio-Editor als zentrales </w:t>
+      </w:r>
+      <w:proofErr w:type="gramStart"/>
+      <w:r>
+        <w:t>Feature .</w:t>
+      </w:r>
+      <w:proofErr w:type="gramEnd"/>
+      <w:r>
+        <w:t xml:space="preserve"> Anschliessend habe ich Mockups für </w:t>
+      </w:r>
+      <w:r>
+        <w:t>einige</w:t>
+      </w:r>
+      <w:r>
+        <w:t xml:space="preserve"> Seiten erstellt, um Design und Benutzerführung festzulegen.</w:t>
+      </w:r>
+    </w:p>
+    <w:p>
+      <w:r>
+        <w:t xml:space="preserve">Darauf aufbauend habe ich die Grundstruktur des </w:t>
+      </w:r>
+      <w:proofErr w:type="spellStart"/>
+      <w:r>
+        <w:t>Frontends</w:t>
+      </w:r>
+      <w:proofErr w:type="spellEnd"/>
+      <w:r>
+        <w:t xml:space="preserve"> umgesetzt und die Landingpage </w:t>
+      </w:r>
+      <w:r>
+        <w:t>ist in der</w:t>
+      </w:r>
+      <w:r>
+        <w:t xml:space="preserve"> </w:t>
+      </w:r>
+      <w:r>
+        <w:t>Realisierung</w:t>
+      </w:r>
+      <w:r>
+        <w:t>.</w:t>
+      </w:r>
+    </w:p>
+    <w:p>
+      <w:r>
+        <w:lastRenderedPageBreak/>
+        <w:t xml:space="preserve">Die Planung ist somit </w:t>
+      </w:r>
+      <w:r>
+        <w:t xml:space="preserve">fast </w:t>
+      </w:r>
+      <w:r>
+        <w:t>abgeschlossen und erste funktionale Teile sind bereits umgesetzt.</w:t>
+      </w:r>
+    </w:p>
+    <w:p>
+      <w:pPr>
+        <w:rPr>
+          <w:b/>
+          <w:bCs/>
+        </w:rPr>
+      </w:pPr>
+      <w:r>
+        <w:rPr>
+          <w:b/>
+          <w:bCs/>
+        </w:rPr>
+        <w:t>Nächste Schritte:</w:t>
+      </w:r>
+    </w:p>
+    <w:p>
+      <w:pPr>
+        <w:pStyle w:val="Listenabsatz"/>
+        <w:numPr>
+          <w:ilvl w:val="0"/>
+          <w:numId w:val="10"/>
+        </w:numPr>
+      </w:pPr>
+      <w:r>
+        <w:t>Realisierung der Pages (Landingpage, Dashboard)</w:t>
+      </w:r>
+    </w:p>
+    <w:p>
+      <w:pPr>
+        <w:pStyle w:val="Listenabsatz"/>
+        <w:numPr>
+          <w:ilvl w:val="0"/>
+          <w:numId w:val="10"/>
+        </w:numPr>
+      </w:pPr>
+      <w:r>
+        <w:t>Umsetzung des Editor Pages im Zusammenspiel mit dem Backend</w:t>
+      </w:r>
+    </w:p>
+    <w:p>
+      <w:pPr>
+        <w:pStyle w:val="Listenabsatz"/>
+        <w:numPr>
+          <w:ilvl w:val="0"/>
+          <w:numId w:val="10"/>
+        </w:numPr>
+      </w:pPr>
+      <w:r>
+        <w:t>Umsetzung der Kernmechaniken (Drag and Drop, Elemente wie Text, Bild, Erfahrung usw.)</w:t>
+      </w:r>
+    </w:p>
+    <w:p>
+      <w:pPr>
+        <w:rPr>
+          <w:b/>
+          <w:bCs/>
+        </w:rPr>
+      </w:pPr>
+      <w:r>
+        <w:rPr>
+          <w:b/>
+          <w:bCs/>
+        </w:rPr>
+        <w:t xml:space="preserve">Frontend </w:t>
+      </w:r>
+      <w:r>
+        <w:rPr>
+          <w:b/>
+          <w:bCs/>
+        </w:rPr>
+        <w:t>Mockup</w:t>
+      </w:r>
+      <w:r>
+        <w:rPr>
+          <w:b/>
+          <w:bCs/>
+        </w:rPr>
+        <w:t>s</w:t>
+      </w:r>
+      <w:r>
+        <w:rPr>
+          <w:b/>
+          <w:bCs/>
+        </w:rPr>
+        <w:t>:</w:t>
+      </w:r>
+    </w:p>
+    <w:p>
+      <w:r>
+        <w:rPr>
+          <w:b/>
+          <w:bCs/>
+          <w:noProof/>
+        </w:rPr>
+        <w:drawing>
+          <wp:anchor distT="0" distB="0" distL="114300" distR="114300" simplePos="0" relativeHeight="251659264" behindDoc="1" locked="0" layoutInCell="1" allowOverlap="1" wp14:anchorId="7FF0612B" wp14:editId="7DFA3592">
+            <wp:simplePos x="0" y="0"/>
+            <wp:positionH relativeFrom="column">
+              <wp:posOffset>2085975</wp:posOffset>
+            </wp:positionH>
+            <wp:positionV relativeFrom="paragraph">
+              <wp:posOffset>19729</wp:posOffset>
+            </wp:positionV>
+            <wp:extent cx="4255177" cy="2897882"/>
+            <wp:effectExtent l="0" t="0" r="0" b="0"/>
+            <wp:wrapNone/>
+            <wp:docPr id="265641397" name="Grafik 2"/>
+            <wp:cNvGraphicFramePr>
+              <a:graphicFrameLocks xmlns:a="http://schemas.openxmlformats.org/drawingml/2006/main" noChangeAspect="1"/>
+            </wp:cNvGraphicFramePr>
+            <a:graphic xmlns:a="http://schemas.openxmlformats.org/drawingml/2006/main">
+              <a:graphicData uri="http://schemas.openxmlformats.org/drawingml/2006/picture">
+                <pic:pic xmlns:pic="http://schemas.openxmlformats.org/drawingml/2006/picture">
+                  <pic:nvPicPr>
+                    <pic:cNvPr id="0" name="Picture 2"/>
+                    <pic:cNvPicPr>
+                      <a:picLocks noChangeAspect="1" noChangeArrowheads="1"/>
+                    </pic:cNvPicPr>
+                  </pic:nvPicPr>
+                  <pic:blipFill>
+                    <a:blip r:embed="rId7" cstate="print">
+                      <a:extLst>
+                        <a:ext uri="{28A0092B-C50C-407E-A947-70E740481C1C}">
+                          <a14:useLocalDpi xmlns:a14="http://schemas.microsoft.com/office/drawing/2010/main" val="0"/>
+                        </a:ext>
+                      </a:extLst>
+                    </a:blip>
+                    <a:srcRect/>
+                    <a:stretch>
+                      <a:fillRect/>
+                    </a:stretch>
+                  </pic:blipFill>
+                  <pic:spPr bwMode="auto">
+                    <a:xfrm>
+                      <a:off x="0" y="0"/>
+                      <a:ext cx="4255177" cy="2897882"/>
+                    </a:xfrm>
+                    <a:prstGeom prst="rect">
+                      <a:avLst/>
+                    </a:prstGeom>
+                    <a:noFill/>
+                    <a:ln>
+                      <a:noFill/>
+                    </a:ln>
+                  </pic:spPr>
+                </pic:pic>
+              </a:graphicData>
+            </a:graphic>
+            <wp14:sizeRelH relativeFrom="margin">
+              <wp14:pctWidth>0</wp14:pctWidth>
+            </wp14:sizeRelH>
+            <wp14:sizeRelV relativeFrom="margin">
+              <wp14:pctHeight>0</wp14:pctHeight>
+            </wp14:sizeRelV>
+          </wp:anchor>
+        </w:drawing>
+      </w:r>
+      <w:r>
+        <w:rPr>
+          <w:noProof/>
+        </w:rPr>
+        <w:drawing>
+          <wp:anchor distT="0" distB="0" distL="114300" distR="114300" simplePos="0" relativeHeight="251658240" behindDoc="1" locked="0" layoutInCell="1" allowOverlap="1" wp14:anchorId="077FC837" wp14:editId="597F26A4">
+            <wp:simplePos x="0" y="0"/>
+            <wp:positionH relativeFrom="column">
+              <wp:posOffset>-55245</wp:posOffset>
+            </wp:positionH>
+            <wp:positionV relativeFrom="paragraph">
+              <wp:posOffset>16510</wp:posOffset>
+            </wp:positionV>
+            <wp:extent cx="1980565" cy="6786880"/>
+            <wp:effectExtent l="0" t="0" r="635" b="0"/>
+            <wp:wrapThrough wrapText="bothSides">
+              <wp:wrapPolygon edited="0">
+                <wp:start x="0" y="0"/>
+                <wp:lineTo x="0" y="21523"/>
+                <wp:lineTo x="21399" y="21523"/>
+                <wp:lineTo x="21399" y="0"/>
+                <wp:lineTo x="0" y="0"/>
+              </wp:wrapPolygon>
+            </wp:wrapThrough>
+            <wp:docPr id="974055635" name="Grafik 1"/>
+            <wp:cNvGraphicFramePr>
+              <a:graphicFrameLocks xmlns:a="http://schemas.openxmlformats.org/drawingml/2006/main" noChangeAspect="1"/>
+            </wp:cNvGraphicFramePr>
+            <a:graphic xmlns:a="http://schemas.openxmlformats.org/drawingml/2006/main">
+              <a:graphicData uri="http://schemas.openxmlformats.org/drawingml/2006/picture">
+                <pic:pic xmlns:pic="http://schemas.openxmlformats.org/drawingml/2006/picture">
+                  <pic:nvPicPr>
+                    <pic:cNvPr id="0" name="Picture 1"/>
+                    <pic:cNvPicPr>
+                      <a:picLocks noChangeAspect="1" noChangeArrowheads="1"/>
+                    </pic:cNvPicPr>
+                  </pic:nvPicPr>
+                  <pic:blipFill>
+                    <a:blip r:embed="rId8" cstate="print">
+                      <a:extLst>
+                        <a:ext uri="{28A0092B-C50C-407E-A947-70E740481C1C}">
+                          <a14:useLocalDpi xmlns:a14="http://schemas.microsoft.com/office/drawing/2010/main" val="0"/>
+                        </a:ext>
+                      </a:extLst>
+                    </a:blip>
+                    <a:srcRect/>
+                    <a:stretch>
+                      <a:fillRect/>
+                    </a:stretch>
+                  </pic:blipFill>
+                  <pic:spPr bwMode="auto">
+                    <a:xfrm>
+                      <a:off x="0" y="0"/>
+                      <a:ext cx="1980565" cy="6786880"/>
+                    </a:xfrm>
+                    <a:prstGeom prst="rect">
+                      <a:avLst/>
+                    </a:prstGeom>
+                    <a:noFill/>
+                    <a:ln>
+                      <a:noFill/>
+                    </a:ln>
+                  </pic:spPr>
+                </pic:pic>
+              </a:graphicData>
+            </a:graphic>
+            <wp14:sizeRelH relativeFrom="margin">
+              <wp14:pctWidth>0</wp14:pctWidth>
+            </wp14:sizeRelH>
+            <wp14:sizeRelV relativeFrom="margin">
+              <wp14:pctHeight>0</wp14:pctHeight>
+            </wp14:sizeRelV>
+          </wp:anchor>
+        </w:drawing>
+      </w:r>
     </w:p>
     <w:p>
       <w:pPr>
@@ -877,19 +1310,267 @@
           <w:szCs w:val="32"/>
         </w:rPr>
       </w:pPr>
-      <w:r>
+    </w:p>
+    <w:p>
+      <w:pPr>
+        <w:spacing w:after="0"/>
         <w:rPr>
           <w:b/>
           <w:bCs/>
           <w:sz w:val="32"/>
           <w:szCs w:val="32"/>
         </w:rPr>
+      </w:pPr>
+    </w:p>
+    <w:p>
+      <w:pPr>
+        <w:spacing w:after="0"/>
+        <w:rPr>
+          <w:b/>
+          <w:bCs/>
+          <w:sz w:val="32"/>
+          <w:szCs w:val="32"/>
+        </w:rPr>
+      </w:pPr>
+    </w:p>
+    <w:p>
+      <w:pPr>
+        <w:spacing w:after="0"/>
+        <w:rPr>
+          <w:b/>
+          <w:bCs/>
+          <w:sz w:val="32"/>
+          <w:szCs w:val="32"/>
+        </w:rPr>
+      </w:pPr>
+    </w:p>
+    <w:p>
+      <w:pPr>
+        <w:spacing w:after="0"/>
+        <w:rPr>
+          <w:b/>
+          <w:bCs/>
+          <w:sz w:val="32"/>
+          <w:szCs w:val="32"/>
+        </w:rPr>
+      </w:pPr>
+    </w:p>
+    <w:p>
+      <w:pPr>
+        <w:spacing w:after="0"/>
+        <w:rPr>
+          <w:b/>
+          <w:bCs/>
+          <w:sz w:val="32"/>
+          <w:szCs w:val="32"/>
+        </w:rPr>
+      </w:pPr>
+    </w:p>
+    <w:p>
+      <w:pPr>
+        <w:spacing w:after="0"/>
+        <w:rPr>
+          <w:b/>
+          <w:bCs/>
+          <w:sz w:val="32"/>
+          <w:szCs w:val="32"/>
+        </w:rPr>
+      </w:pPr>
+    </w:p>
+    <w:p>
+      <w:pPr>
+        <w:spacing w:after="0"/>
+        <w:rPr>
+          <w:b/>
+          <w:bCs/>
+          <w:sz w:val="32"/>
+          <w:szCs w:val="32"/>
+        </w:rPr>
+      </w:pPr>
+    </w:p>
+    <w:p>
+      <w:pPr>
+        <w:spacing w:after="0"/>
+        <w:rPr>
+          <w:b/>
+          <w:bCs/>
+          <w:sz w:val="32"/>
+          <w:szCs w:val="32"/>
+        </w:rPr>
+      </w:pPr>
+    </w:p>
+    <w:p>
+      <w:pPr>
+        <w:spacing w:after="0"/>
+        <w:rPr>
+          <w:b/>
+          <w:bCs/>
+          <w:sz w:val="32"/>
+          <w:szCs w:val="32"/>
+        </w:rPr>
+      </w:pPr>
+    </w:p>
+    <w:p>
+      <w:pPr>
+        <w:spacing w:after="0"/>
+        <w:rPr>
+          <w:b/>
+          <w:bCs/>
+          <w:sz w:val="32"/>
+          <w:szCs w:val="32"/>
+        </w:rPr>
+      </w:pPr>
+    </w:p>
+    <w:p>
+      <w:pPr>
+        <w:spacing w:after="0"/>
+        <w:rPr>
+          <w:b/>
+          <w:bCs/>
+          <w:sz w:val="32"/>
+          <w:szCs w:val="32"/>
+        </w:rPr>
+      </w:pPr>
+    </w:p>
+    <w:p>
+      <w:pPr>
+        <w:spacing w:after="0"/>
+        <w:rPr>
+          <w:b/>
+          <w:bCs/>
+          <w:sz w:val="32"/>
+          <w:szCs w:val="32"/>
+        </w:rPr>
+      </w:pPr>
+    </w:p>
+    <w:p>
+      <w:pPr>
+        <w:spacing w:after="0"/>
+        <w:rPr>
+          <w:b/>
+          <w:bCs/>
+          <w:sz w:val="32"/>
+          <w:szCs w:val="32"/>
+        </w:rPr>
+      </w:pPr>
+    </w:p>
+    <w:p>
+      <w:pPr>
+        <w:spacing w:after="0"/>
+        <w:rPr>
+          <w:b/>
+          <w:bCs/>
+          <w:sz w:val="32"/>
+          <w:szCs w:val="32"/>
+        </w:rPr>
+      </w:pPr>
+    </w:p>
+    <w:p>
+      <w:pPr>
+        <w:spacing w:after="0"/>
+        <w:rPr>
+          <w:b/>
+          <w:bCs/>
+          <w:sz w:val="32"/>
+          <w:szCs w:val="32"/>
+        </w:rPr>
+      </w:pPr>
+    </w:p>
+    <w:p>
+      <w:pPr>
+        <w:spacing w:after="0"/>
+        <w:rPr>
+          <w:b/>
+          <w:bCs/>
+          <w:sz w:val="32"/>
+          <w:szCs w:val="32"/>
+        </w:rPr>
+      </w:pPr>
+    </w:p>
+    <w:p>
+      <w:pPr>
+        <w:spacing w:after="0"/>
+        <w:rPr>
+          <w:b/>
+          <w:bCs/>
+          <w:sz w:val="32"/>
+          <w:szCs w:val="32"/>
+        </w:rPr>
+      </w:pPr>
+    </w:p>
+    <w:p>
+      <w:pPr>
+        <w:spacing w:after="0"/>
+        <w:rPr>
+          <w:b/>
+          <w:bCs/>
+          <w:sz w:val="32"/>
+          <w:szCs w:val="32"/>
+        </w:rPr>
+      </w:pPr>
+    </w:p>
+    <w:p>
+      <w:pPr>
+        <w:spacing w:after="0"/>
+        <w:rPr>
+          <w:b/>
+          <w:bCs/>
+          <w:sz w:val="32"/>
+          <w:szCs w:val="32"/>
+        </w:rPr>
+      </w:pPr>
+    </w:p>
+    <w:p>
+      <w:pPr>
+        <w:spacing w:after="0"/>
+        <w:rPr>
+          <w:b/>
+          <w:bCs/>
+          <w:sz w:val="32"/>
+          <w:szCs w:val="32"/>
+        </w:rPr>
+      </w:pPr>
+    </w:p>
+    <w:p>
+      <w:pPr>
+        <w:spacing w:after="0"/>
+        <w:rPr>
+          <w:b/>
+          <w:bCs/>
+          <w:sz w:val="32"/>
+          <w:szCs w:val="32"/>
+        </w:rPr>
+      </w:pPr>
+    </w:p>
+    <w:p>
+      <w:pPr>
+        <w:spacing w:after="0"/>
+        <w:rPr>
+          <w:b/>
+          <w:bCs/>
+          <w:sz w:val="32"/>
+          <w:szCs w:val="32"/>
+        </w:rPr>
+      </w:pPr>
+      <w:r>
+        <w:rPr>
+          <w:b/>
+          <w:bCs/>
+          <w:sz w:val="32"/>
+          <w:szCs w:val="32"/>
+        </w:rPr>
+        <w:lastRenderedPageBreak/>
         <w:t>5 Datenbankmodell</w:t>
       </w:r>
     </w:p>
+    <w:p>
+      <w:r>
+        <w:t>(siehe Anhang)</w:t>
+      </w:r>
+    </w:p>
     <w:sectPr>
-      <w:headerReference w:type="default" r:id="rId7"/>
-      <w:footerReference w:type="default" r:id="rId8"/>
+      <w:headerReference w:type="default" r:id="rId9"/>
+      <w:footerReference w:type="default" r:id="rId10"/>
       <w:pgSz w:w="11906" w:h="16838"/>
       <w:pgMar w:top="1417" w:right="1417" w:bottom="1134" w:left="1417" w:header="708" w:footer="708" w:gutter="0"/>
       <w:cols w:space="708"/>
@@ -1354,6 +2035,119 @@
     </w:lvl>
   </w:abstractNum>
   <w:abstractNum w:abstractNumId="3" w15:restartNumberingAfterBreak="0">
+    <w:nsid w:val="2B824D93"/>
+    <w:multiLevelType w:val="hybridMultilevel"/>
+    <w:tmpl w:val="79FE64A2"/>
+    <w:lvl w:ilvl="0" w:tplc="08070001">
+      <w:start w:val="1"/>
+      <w:numFmt w:val="bullet"/>
+      <w:lvlText w:val=""/>
+      <w:lvlJc w:val="left"/>
+      <w:pPr>
+        <w:ind w:left="720" w:hanging="360"/>
+      </w:pPr>
+      <w:rPr>
+        <w:rFonts w:ascii="Symbol" w:hAnsi="Symbol" w:hint="default"/>
+      </w:rPr>
+    </w:lvl>
+    <w:lvl w:ilvl="1" w:tplc="08070003" w:tentative="1">
+      <w:start w:val="1"/>
+      <w:numFmt w:val="bullet"/>
+      <w:lvlText w:val="o"/>
+      <w:lvlJc w:val="left"/>
+      <w:pPr>
+        <w:ind w:left="1440" w:hanging="360"/>
+      </w:pPr>
+      <w:rPr>
+        <w:rFonts w:ascii="Courier New" w:hAnsi="Courier New" w:cs="Courier New" w:hint="default"/>
+      </w:rPr>
+    </w:lvl>
+    <w:lvl w:ilvl="2" w:tplc="08070005" w:tentative="1">
+      <w:start w:val="1"/>
+      <w:numFmt w:val="bullet"/>
+      <w:lvlText w:val=""/>
+      <w:lvlJc w:val="left"/>
+      <w:pPr>
+        <w:ind w:left="2160" w:hanging="360"/>
+      </w:pPr>
+      <w:rPr>
+        <w:rFonts w:ascii="Wingdings" w:hAnsi="Wingdings" w:hint="default"/>
+      </w:rPr>
+    </w:lvl>
+    <w:lvl w:ilvl="3" w:tplc="08070001" w:tentative="1">
+      <w:start w:val="1"/>
+      <w:numFmt w:val="bullet"/>
+      <w:lvlText w:val=""/>
+      <w:lvlJc w:val="left"/>
+      <w:pPr>
+        <w:ind w:left="2880" w:hanging="360"/>
+      </w:pPr>
+      <w:rPr>
+        <w:rFonts w:ascii="Symbol" w:hAnsi="Symbol" w:hint="default"/>
+      </w:rPr>
+    </w:lvl>
+    <w:lvl w:ilvl="4" w:tplc="08070003" w:tentative="1">
+      <w:start w:val="1"/>
+      <w:numFmt w:val="bullet"/>
+      <w:lvlText w:val="o"/>
+      <w:lvlJc w:val="left"/>
+      <w:pPr>
+        <w:ind w:left="3600" w:hanging="360"/>
+      </w:pPr>
+      <w:rPr>
+        <w:rFonts w:ascii="Courier New" w:hAnsi="Courier New" w:cs="Courier New" w:hint="default"/>
+      </w:rPr>
+    </w:lvl>
+    <w:lvl w:ilvl="5" w:tplc="08070005" w:tentative="1">
+      <w:start w:val="1"/>
+      <w:numFmt w:val="bullet"/>
+      <w:lvlText w:val=""/>
+      <w:lvlJc w:val="left"/>
+      <w:pPr>
+        <w:ind w:left="4320" w:hanging="360"/>
+      </w:pPr>
+      <w:rPr>
+        <w:rFonts w:ascii="Wingdings" w:hAnsi="Wingdings" w:hint="default"/>
+      </w:rPr>
+    </w:lvl>
+    <w:lvl w:ilvl="6" w:tplc="08070001" w:tentative="1">
+      <w:start w:val="1"/>
+      <w:numFmt w:val="bullet"/>
+      <w:lvlText w:val=""/>
+      <w:lvlJc w:val="left"/>
+      <w:pPr>
+        <w:ind w:left="5040" w:hanging="360"/>
+      </w:pPr>
+      <w:rPr>
+        <w:rFonts w:ascii="Symbol" w:hAnsi="Symbol" w:hint="default"/>
+      </w:rPr>
+    </w:lvl>
+    <w:lvl w:ilvl="7" w:tplc="08070003" w:tentative="1">
+      <w:start w:val="1"/>
+      <w:numFmt w:val="bullet"/>
+      <w:lvlText w:val="o"/>
+      <w:lvlJc w:val="left"/>
+      <w:pPr>
+        <w:ind w:left="5760" w:hanging="360"/>
+      </w:pPr>
+      <w:rPr>
+        <w:rFonts w:ascii="Courier New" w:hAnsi="Courier New" w:cs="Courier New" w:hint="default"/>
+      </w:rPr>
+    </w:lvl>
+    <w:lvl w:ilvl="8" w:tplc="08070005" w:tentative="1">
+      <w:start w:val="1"/>
+      <w:numFmt w:val="bullet"/>
+      <w:lvlText w:val=""/>
+      <w:lvlJc w:val="left"/>
+      <w:pPr>
+        <w:ind w:left="6480" w:hanging="360"/>
+      </w:pPr>
+      <w:rPr>
+        <w:rFonts w:ascii="Wingdings" w:hAnsi="Wingdings" w:hint="default"/>
+      </w:rPr>
+    </w:lvl>
+  </w:abstractNum>
+  <w:abstractNum w:abstractNumId="4" w15:restartNumberingAfterBreak="0">
     <w:nsid w:val="37282AFA"/>
     <w:multiLevelType w:val="hybridMultilevel"/>
     <w:tmpl w:val="EC34053A"/>
@@ -1466,7 +2260,120 @@
       </w:rPr>
     </w:lvl>
   </w:abstractNum>
-  <w:abstractNum w:abstractNumId="4" w15:restartNumberingAfterBreak="0">
+  <w:abstractNum w:abstractNumId="5" w15:restartNumberingAfterBreak="0">
+    <w:nsid w:val="48581823"/>
+    <w:multiLevelType w:val="hybridMultilevel"/>
+    <w:tmpl w:val="6CF0C3BC"/>
+    <w:lvl w:ilvl="0" w:tplc="08070001">
+      <w:start w:val="1"/>
+      <w:numFmt w:val="bullet"/>
+      <w:lvlText w:val=""/>
+      <w:lvlJc w:val="left"/>
+      <w:pPr>
+        <w:ind w:left="720" w:hanging="360"/>
+      </w:pPr>
+      <w:rPr>
+        <w:rFonts w:ascii="Symbol" w:hAnsi="Symbol" w:hint="default"/>
+      </w:rPr>
+    </w:lvl>
+    <w:lvl w:ilvl="1" w:tplc="08070003" w:tentative="1">
+      <w:start w:val="1"/>
+      <w:numFmt w:val="bullet"/>
+      <w:lvlText w:val="o"/>
+      <w:lvlJc w:val="left"/>
+      <w:pPr>
+        <w:ind w:left="1440" w:hanging="360"/>
+      </w:pPr>
+      <w:rPr>
+        <w:rFonts w:ascii="Courier New" w:hAnsi="Courier New" w:cs="Courier New" w:hint="default"/>
+      </w:rPr>
+    </w:lvl>
+    <w:lvl w:ilvl="2" w:tplc="08070005" w:tentative="1">
+      <w:start w:val="1"/>
+      <w:numFmt w:val="bullet"/>
+      <w:lvlText w:val=""/>
+      <w:lvlJc w:val="left"/>
+      <w:pPr>
+        <w:ind w:left="2160" w:hanging="360"/>
+      </w:pPr>
+      <w:rPr>
+        <w:rFonts w:ascii="Wingdings" w:hAnsi="Wingdings" w:hint="default"/>
+      </w:rPr>
+    </w:lvl>
+    <w:lvl w:ilvl="3" w:tplc="08070001" w:tentative="1">
+      <w:start w:val="1"/>
+      <w:numFmt w:val="bullet"/>
+      <w:lvlText w:val=""/>
+      <w:lvlJc w:val="left"/>
+      <w:pPr>
+        <w:ind w:left="2880" w:hanging="360"/>
+      </w:pPr>
+      <w:rPr>
+        <w:rFonts w:ascii="Symbol" w:hAnsi="Symbol" w:hint="default"/>
+      </w:rPr>
+    </w:lvl>
+    <w:lvl w:ilvl="4" w:tplc="08070003" w:tentative="1">
+      <w:start w:val="1"/>
+      <w:numFmt w:val="bullet"/>
+      <w:lvlText w:val="o"/>
+      <w:lvlJc w:val="left"/>
+      <w:pPr>
+        <w:ind w:left="3600" w:hanging="360"/>
+      </w:pPr>
+      <w:rPr>
+        <w:rFonts w:ascii="Courier New" w:hAnsi="Courier New" w:cs="Courier New" w:hint="default"/>
+      </w:rPr>
+    </w:lvl>
+    <w:lvl w:ilvl="5" w:tplc="08070005" w:tentative="1">
+      <w:start w:val="1"/>
+      <w:numFmt w:val="bullet"/>
+      <w:lvlText w:val=""/>
+      <w:lvlJc w:val="left"/>
+      <w:pPr>
+        <w:ind w:left="4320" w:hanging="360"/>
+      </w:pPr>
+      <w:rPr>
+        <w:rFonts w:ascii="Wingdings" w:hAnsi="Wingdings" w:hint="default"/>
+      </w:rPr>
+    </w:lvl>
+    <w:lvl w:ilvl="6" w:tplc="08070001" w:tentative="1">
+      <w:start w:val="1"/>
+      <w:numFmt w:val="bullet"/>
+      <w:lvlText w:val=""/>
+      <w:lvlJc w:val="left"/>
+      <w:pPr>
+        <w:ind w:left="5040" w:hanging="360"/>
+      </w:pPr>
+      <w:rPr>
+        <w:rFonts w:ascii="Symbol" w:hAnsi="Symbol" w:hint="default"/>
+      </w:rPr>
+    </w:lvl>
+    <w:lvl w:ilvl="7" w:tplc="08070003" w:tentative="1">
+      <w:start w:val="1"/>
+      <w:numFmt w:val="bullet"/>
+      <w:lvlText w:val="o"/>
+      <w:lvlJc w:val="left"/>
+      <w:pPr>
+        <w:ind w:left="5760" w:hanging="360"/>
+      </w:pPr>
+      <w:rPr>
+        <w:rFonts w:ascii="Courier New" w:hAnsi="Courier New" w:cs="Courier New" w:hint="default"/>
+      </w:rPr>
+    </w:lvl>
+    <w:lvl w:ilvl="8" w:tplc="08070005" w:tentative="1">
+      <w:start w:val="1"/>
+      <w:numFmt w:val="bullet"/>
+      <w:lvlText w:val=""/>
+      <w:lvlJc w:val="left"/>
+      <w:pPr>
+        <w:ind w:left="6480" w:hanging="360"/>
+      </w:pPr>
+      <w:rPr>
+        <w:rFonts w:ascii="Wingdings" w:hAnsi="Wingdings" w:hint="default"/>
+      </w:rPr>
+    </w:lvl>
+  </w:abstractNum>
+  <w:abstractNum w:abstractNumId="6" w15:restartNumberingAfterBreak="0">
     <w:nsid w:val="5C920F5D"/>
     <w:multiLevelType w:val="hybridMultilevel"/>
     <w:tmpl w:val="C8424412"/>
@@ -1555,7 +2462,7 @@
       </w:pPr>
     </w:lvl>
   </w:abstractNum>
-  <w:abstractNum w:abstractNumId="5" w15:restartNumberingAfterBreak="0">
+  <w:abstractNum w:abstractNumId="7" w15:restartNumberingAfterBreak="0">
     <w:nsid w:val="643758A3"/>
     <w:multiLevelType w:val="hybridMultilevel"/>
     <w:tmpl w:val="0F6285BA"/>
@@ -1668,7 +2575,7 @@
       </w:rPr>
     </w:lvl>
   </w:abstractNum>
-  <w:abstractNum w:abstractNumId="6" w15:restartNumberingAfterBreak="0">
+  <w:abstractNum w:abstractNumId="8" w15:restartNumberingAfterBreak="0">
     <w:nsid w:val="64402D35"/>
     <w:multiLevelType w:val="hybridMultilevel"/>
     <w:tmpl w:val="19CAE084"/>
@@ -1781,7 +2688,7 @@
       </w:rPr>
     </w:lvl>
   </w:abstractNum>
-  <w:abstractNum w:abstractNumId="7" w15:restartNumberingAfterBreak="0">
+  <w:abstractNum w:abstractNumId="9" w15:restartNumberingAfterBreak="0">
     <w:nsid w:val="6CE01A7B"/>
     <w:multiLevelType w:val="hybridMultilevel"/>
     <w:tmpl w:val="276EFA3A"/>
@@ -1895,28 +2802,34 @@
     </w:lvl>
   </w:abstractNum>
   <w:num w:numId="1" w16cid:durableId="976110949">
-    <w:abstractNumId w:val="4"/>
+    <w:abstractNumId w:val="6"/>
   </w:num>
   <w:num w:numId="2" w16cid:durableId="1158689609">
-    <w:abstractNumId w:val="5"/>
+    <w:abstractNumId w:val="7"/>
   </w:num>
   <w:num w:numId="3" w16cid:durableId="1242108170">
     <w:abstractNumId w:val="0"/>
   </w:num>
   <w:num w:numId="4" w16cid:durableId="260575121">
-    <w:abstractNumId w:val="7"/>
+    <w:abstractNumId w:val="9"/>
   </w:num>
   <w:num w:numId="5" w16cid:durableId="1728410766">
-    <w:abstractNumId w:val="3"/>
+    <w:abstractNumId w:val="4"/>
   </w:num>
   <w:num w:numId="6" w16cid:durableId="1333290101">
     <w:abstractNumId w:val="2"/>
   </w:num>
   <w:num w:numId="7" w16cid:durableId="318267704">
-    <w:abstractNumId w:val="6"/>
+    <w:abstractNumId w:val="8"/>
   </w:num>
   <w:num w:numId="8" w16cid:durableId="739329088">
     <w:abstractNumId w:val="1"/>
+  </w:num>
+  <w:num w:numId="9" w16cid:durableId="1848908325">
+    <w:abstractNumId w:val="3"/>
+  </w:num>
+  <w:num w:numId="10" w16cid:durableId="1941061717">
+    <w:abstractNumId w:val="5"/>
   </w:num>
 </w:numbering>
 </file>
@@ -2524,7 +3437,6 @@
   <w:style w:type="character" w:default="1" w:styleId="Absatz-Standardschriftart">
     <w:name w:val="Default Paragraph Font"/>
     <w:uiPriority w:val="1"/>
-    <w:semiHidden/>
     <w:unhideWhenUsed/>
   </w:style>
   <w:style w:type="table" w:default="1" w:styleId="NormaleTabelle">

</xml_diff>